<commit_message>
scrape: add Glue 31 flower (48 products)
</commit_message>
<xml_diff>
--- a/docs/dinky-available-guide.docx
+++ b/docs/dinky-available-guide.docx
@@ -843,6 +843,71 @@
           <w:b w:val="0"/>
         </w:rPr>
         <w:t>Produced by Campfire Cannabis, Fight Club sits at a robust 22.3% THC, making it suitable for intermediate to experienced consumers. Buds are typically dense and frosty with a Runtz-inspired purple-green coloration, coated in milky trichomes and vivid orange pistils. Best enjoyed during afternoon or early evening sessions when creativity and focus are desired without full sedation.</w:t>
+      </w:r>
+    </w:p>
+    <w:p/>
+    <w:p>
+      <w:r>
+        <w:rPr>
+          <w:b/>
+          <w:sz w:val="32"/>
+        </w:rPr>
+        <w:t>Glue 31</w:t>
+      </w:r>
+      <w:r>
+        <w:rPr>
+          <w:b/>
+        </w:rPr>
+        <w:tab/>
+      </w:r>
+      <w:r>
+        <w:rPr>
+          <w:b w:val="0"/>
+          <w:sz w:val="28"/>
+        </w:rPr>
+        <w:t>-   Hybrid</w:t>
+      </w:r>
+    </w:p>
+    <w:p>
+      <w:r>
+        <w:rPr>
+          <w:b/>
+        </w:rPr>
+        <w:t xml:space="preserve">Effects: </w:t>
+      </w:r>
+      <w:r>
+        <w:rPr>
+          <w:b w:val="0"/>
+        </w:rPr>
+        <w:t>Blissful, Cerebral, Creative, Euphoric, Relaxing</w:t>
+      </w:r>
+    </w:p>
+    <w:p>
+      <w:r>
+        <w:rPr>
+          <w:b/>
+        </w:rPr>
+        <w:t xml:space="preserve">Flavors: </w:t>
+      </w:r>
+      <w:r>
+        <w:rPr>
+          <w:b w:val="0"/>
+        </w:rPr>
+        <w:t>Diesel, Earthy, Fruity, Gasoline, Nutty, Sweet</w:t>
+      </w:r>
+    </w:p>
+    <w:p>
+      <w:r>
+        <w:rPr>
+          <w:b/>
+        </w:rPr>
+        <w:t xml:space="preserve">Terpenes: </w:t>
+      </w:r>
+      <w:r>
+        <w:rPr>
+          <w:b w:val="0"/>
+        </w:rPr>
+        <w:t>Linalool, Caryophyllene, Terpinolene, Geraniol, Valencene, Bisabolol</w:t>
       </w:r>
     </w:p>
     <w:p/>

</xml_diff>